<commit_message>
docs: reemplaza el ASCII del SRS por un diagrama real y unifica el Modelo de BD
- SRS: el diagrama de contexto textual (caracteres de dibujo de caja)
  se reemplaza por una imagen real (actores + frontend + backend +
  PostgreSQL/R2/RENAPER/17TRACK), en el mismo estilo que el resto de
  los diagramas del TP.
- Modelo de Base de Datos: se unifican los dos diagramas (núcleo /
  turnos-logística-catálogo) en uno solo con las 13 tablas, igual que
  se hizo antes con el Modelo de Dominio. Se renumeran las secciones
  del documento en consecuencia.

Se actualiza también el documento combinado del TP.
</commit_message>
<xml_diff>
--- a/docs/modelo-bd/MODELO_BASE_DE_DATOS.docx
+++ b/docs/modelo-bd/MODELO_BASE_DE_DATOS.docx
@@ -202,7 +202,19 @@
         <w:spacing w:after="180" w:before="420"/>
       </w:pPr>
       <w:r>
-        <w:t xml:space="preserve">2. Diagrama — Núcleo (solicitantes, donaciones e inventario)</w:t>
+        <w:t xml:space="preserve">2. Diagrama</w:t>
+      </w:r>
+    </w:p>
+    <w:p>
+      <w:pPr>
+        <w:spacing w:after="140"/>
+      </w:pPr>
+      <w:r>
+        <w:rPr>
+          <w:i/>
+          <w:iCs/>
+        </w:rPr>
+        <w:t xml:space="preserve">Las 13 tablas del esquema en un único diagrama.</w:t>
       </w:r>
     </w:p>
     <w:tbl>
@@ -244,7 +256,7 @@
             <w:r>
               <w:drawing>
                 <wp:inline distT="0" distB="0" distL="0" distR="0">
-                  <wp:extent cx="6276975" cy="3295650"/>
+                  <wp:extent cx="6276975" cy="4152900"/>
                   <wp:effectExtent t="0" r="0" b="0" l="0"/>
                   <wp:docPr id="1" name="" descr="" title=""/>
                   <wp:cNvGraphicFramePr>
@@ -269,96 +281,7 @@
                         <pic:spPr bwMode="auto">
                           <a:xfrm>
                             <a:off x="0" y="0"/>
-                            <a:ext cx="6276975" cy="3295650"/>
-                          </a:xfrm>
-                          <a:prstGeom prst="rect">
-                            <a:avLst/>
-                          </a:prstGeom>
-                        </pic:spPr>
-                      </pic:pic>
-                    </a:graphicData>
-                  </a:graphic>
-                </wp:inline>
-              </w:drawing>
-            </w:r>
-          </w:p>
-        </w:tc>
-      </w:tr>
-    </w:tbl>
-    <w:p>
-      <w:pPr>
-        <w:pStyle w:val="Heading1"/>
-        <w:spacing w:after="180" w:before="420"/>
-      </w:pPr>
-      <w:r>
-        <w:t xml:space="preserve">3. Diagrama — Turnos, Logística y Catálogo</w:t>
-      </w:r>
-    </w:p>
-    <w:tbl>
-      <w:tblPr>
-        <w:tblW w:type="dxa" w:w="10080"/>
-        <w:tblBorders>
-          <w:top w:val="single" w:color="auto" w:sz="4"/>
-          <w:left w:val="single" w:color="auto" w:sz="4"/>
-          <w:bottom w:val="single" w:color="auto" w:sz="4"/>
-          <w:right w:val="single" w:color="auto" w:sz="4"/>
-          <w:insideH w:val="single" w:color="auto" w:sz="4"/>
-          <w:insideV w:val="single" w:color="auto" w:sz="4"/>
-        </w:tblBorders>
-      </w:tblPr>
-      <w:tblGrid>
-        <w:gridCol w:w="10080"/>
-      </w:tblGrid>
-      <w:tr>
-        <w:tc>
-          <w:tcPr>
-            <w:tcW w:type="dxa" w:w="10080"/>
-            <w:tcBorders>
-              <w:top w:val="single" w:color="999999" w:sz="4"/>
-              <w:left w:val="single" w:color="999999" w:sz="4"/>
-              <w:bottom w:val="single" w:color="999999" w:sz="4"/>
-              <w:right w:val="single" w:color="999999" w:sz="4"/>
-            </w:tcBorders>
-            <w:tcMar>
-              <w:top w:type="dxa" w:w="100"/>
-              <w:left w:type="dxa" w:w="100"/>
-              <w:bottom w:type="dxa" w:w="100"/>
-              <w:right w:type="dxa" w:w="100"/>
-            </w:tcMar>
-          </w:tcPr>
-          <w:p>
-            <w:pPr>
-              <w:jc w:val="center"/>
-            </w:pPr>
-            <w:r>
-              <w:drawing>
-                <wp:inline distT="0" distB="0" distL="0" distR="0">
-                  <wp:extent cx="6276975" cy="2552700"/>
-                  <wp:effectExtent t="0" r="0" b="0" l="0"/>
-                  <wp:docPr id="1" name="" descr="" title=""/>
-                  <wp:cNvGraphicFramePr>
-                    <a:graphicFrameLocks xmlns:a="http://schemas.openxmlformats.org/drawingml/2006/main" noChangeAspect="1"/>
-                  </wp:cNvGraphicFramePr>
-                  <a:graphic xmlns:a="http://schemas.openxmlformats.org/drawingml/2006/main">
-                    <a:graphicData uri="http://schemas.openxmlformats.org/drawingml/2006/picture">
-                      <pic:pic xmlns:pic="http://schemas.openxmlformats.org/drawingml/2006/picture">
-                        <pic:nvPicPr>
-                          <pic:cNvPr id="0" name="" descr=""/>
-                          <pic:cNvPicPr>
-                            <a:picLocks noChangeAspect="1" noChangeArrowheads="1"/>
-                          </pic:cNvPicPr>
-                        </pic:nvPicPr>
-                        <pic:blipFill>
-                          <a:blip r:embed="rId10" cstate="none"/>
-                          <a:srcRect/>
-                          <a:stretch>
-                            <a:fillRect/>
-                          </a:stretch>
-                        </pic:blipFill>
-                        <pic:spPr bwMode="auto">
-                          <a:xfrm>
-                            <a:off x="0" y="0"/>
-                            <a:ext cx="6276975" cy="2552700"/>
+                            <a:ext cx="6276975" cy="4152900"/>
                           </a:xfrm>
                           <a:prstGeom prst="rect">
                             <a:avLst/>
@@ -383,7 +306,7 @@
           <w:i/>
           <w:iCs/>
         </w:rPr>
-        <w:t xml:space="preserve">Ambos diagramas muestran columnas clave (PK/FK/UNIQUE + atributos distintivos) para que se lean de un vistazo. El detalle completo de cada tabla está en el diccionario de datos (sección 4).</w:t>
+        <w:t xml:space="preserve">El diagrama muestra columnas clave (PK/FK/UNIQUE + atributos distintivos) para que se lea de un vistazo. El detalle completo de cada tabla está en el diccionario de datos (sección 3).</w:t>
       </w:r>
     </w:p>
     <w:p>
@@ -392,7 +315,7 @@
         <w:spacing w:after="180" w:before="420"/>
       </w:pPr>
       <w:r>
-        <w:t xml:space="preserve">4. Diccionario de datos</w:t>
+        <w:t xml:space="preserve">3. Diccionario de datos</w:t>
       </w:r>
     </w:p>
     <w:p>
@@ -13490,7 +13413,7 @@
         <w:spacing w:after="180" w:before="420"/>
       </w:pPr>
       <w:r>
-        <w:t xml:space="preserve">5. Índices</w:t>
+        <w:t xml:space="preserve">4. Índices</w:t>
       </w:r>
     </w:p>
     <w:tbl>
@@ -14559,7 +14482,7 @@
         <w:spacing w:after="180" w:before="420"/>
       </w:pPr>
       <w:r>
-        <w:t xml:space="preserve">6. Decisiones de diseño transversales</w:t>
+        <w:t xml:space="preserve">5. Decisiones de diseño transversales</w:t>
       </w:r>
     </w:p>
     <w:p>

</xml_diff>